<commit_message>
docs(lab): require users to set git identity matching their GitLab account
The org enforces author-name + verified-committer push rules on human pushes too,
not just the CI bot. Add a Prerequisites step (git config user.name/email +
--amend --reset-author) and troubleshooting rows; regenerate LAB-GUIDE.docx.

Co-Authored-By: Claude Opus 4.8 <noreply@anthropic.com>
</commit_message>
<xml_diff>
--- a/labs/three-tier/LAB-GUIDE.docx
+++ b/labs/three-tier/LAB-GUIDE.docx
@@ -1179,6 +1179,171 @@
           <w:szCs w:val="19"/>
         </w:rPr>
         <w:t xml:space="preserve">  git ls-remote &lt;LAB_REPO_URL&gt;     # should list refs, not prompt-fail</w:t>
+      </w:r>
+    </w:p>
+    <w:p>
+      <w:pPr>
+        <w:pStyle w:val="ListParagraph"/>
+        <w:numPr>
+          <w:ilvl w:val="0"/>
+          <w:numId w:val="2"/>
+        </w:numPr>
+        <w:spacing w:after="60"/>
+      </w:pPr>
+      <w:r>
+        <w:rPr>
+          <w:b/>
+          <w:bCs/>
+        </w:rPr>
+        <w:t xml:space="preserve">Git identity matching your GitLab account</w:t>
+      </w:r>
+      <w:r>
+        <w:t xml:space="preserve"> — this GitLab enforces push rules</w:t>
+      </w:r>
+    </w:p>
+    <w:p>
+      <w:pPr>
+        <w:spacing w:after="120"/>
+      </w:pPr>
+      <w:r>
+        <w:t xml:space="preserve">  that reject commits whose </w:t>
+      </w:r>
+      <w:r>
+        <w:rPr>
+          <w:b/>
+          <w:bCs/>
+        </w:rPr>
+        <w:t xml:space="preserve">author name</w:t>
+      </w:r>
+      <w:r>
+        <w:t xml:space="preserve"> or </w:t>
+      </w:r>
+      <w:r>
+        <w:rPr>
+          <w:b/>
+          <w:bCs/>
+        </w:rPr>
+        <w:t xml:space="preserve">email</w:t>
+      </w:r>
+      <w:r>
+        <w:t xml:space="preserve"> don't match your account.   Set them once per clone (Full name from </w:t>
+      </w:r>
+      <w:r>
+        <w:rPr>
+          <w:b/>
+          <w:bCs/>
+        </w:rPr>
+        <w:t xml:space="preserve">Edit profile</w:t>
+      </w:r>
+      <w:r>
+        <w:t xml:space="preserve">; a </w:t>
+      </w:r>
+      <w:r>
+        <w:rPr>
+          <w:b/>
+          <w:bCs/>
+        </w:rPr>
+        <w:t xml:space="preserve">verified</w:t>
+      </w:r>
+      <w:r>
+        <w:t xml:space="preserve"> email   from </w:t>
+      </w:r>
+      <w:r>
+        <w:rPr>
+          <w:b/>
+          <w:bCs/>
+        </w:rPr>
+        <w:t xml:space="preserve">Profile → Emails</w:t>
+      </w:r>
+      <w:r>
+        <w:t xml:space="preserve">):</w:t>
+      </w:r>
+    </w:p>
+    <w:p>
+      <w:pPr>
+        <w:pBdr>
+          <w:top w:val="single" w:color="D0D4D8" w:sz="6" w:space="6"/>
+          <w:bottom w:val="single" w:color="D0D4D8" w:sz="6" w:space="6"/>
+          <w:left w:val="single" w:color="D0D4D8" w:sz="6" w:space="8"/>
+          <w:right w:val="single" w:color="D0D4D8" w:sz="6" w:space="8"/>
+        </w:pBdr>
+        <w:shd w:fill="F2F3F5" w:color="auto" w:val="clear"/>
+        <w:spacing w:after="140" w:before="80" w:line="264"/>
+      </w:pPr>
+      <w:r>
+        <w:rPr>
+          <w:rFonts w:ascii="Consolas" w:cs="Consolas" w:eastAsia="Consolas" w:hAnsi="Consolas"/>
+          <w:sz w:val="19"/>
+          <w:szCs w:val="19"/>
+        </w:rPr>
+        <w:t xml:space="preserve">  git config user.name  "Your GitLab Full Name"   # or your username</w:t>
+      </w:r>
+      <w:r>
+        <w:br/>
+      </w:r>
+      <w:r>
+        <w:rPr>
+          <w:rFonts w:ascii="Consolas" w:cs="Consolas" w:eastAsia="Consolas" w:hAnsi="Consolas"/>
+          <w:sz w:val="19"/>
+          <w:szCs w:val="19"/>
+        </w:rPr>
+        <w:t xml:space="preserve">  git config user.email "you@verified-email"      # must be verified on GitLab</w:t>
+      </w:r>
+    </w:p>
+    <w:p>
+      <w:pPr>
+        <w:spacing w:after="120"/>
+      </w:pPr>
+      <w:r>
+        <w:t xml:space="preserve">  Symptom if unset: </w:t>
+      </w:r>
+      <w:r>
+        <w:rPr>
+          <w:rFonts w:ascii="Consolas" w:cs="Consolas" w:eastAsia="Consolas" w:hAnsi="Consolas"/>
+          <w:sz w:val="19"/>
+          <w:szCs w:val="19"/>
+          <w:shd w:fill="F2F3F5" w:color="auto" w:val="clear"/>
+        </w:rPr>
+        <w:t xml:space="preserve">Your git author name is inconsistent with GitLab account name</w:t>
+      </w:r>
+      <w:r>
+        <w:t xml:space="preserve">   / </w:t>
+      </w:r>
+      <w:r>
+        <w:rPr>
+          <w:rFonts w:ascii="Consolas" w:cs="Consolas" w:eastAsia="Consolas" w:hAnsi="Consolas"/>
+          <w:sz w:val="19"/>
+          <w:szCs w:val="19"/>
+          <w:shd w:fill="F2F3F5" w:color="auto" w:val="clear"/>
+        </w:rPr>
+        <w:t xml:space="preserve">committer email … is not verified</w:t>
+      </w:r>
+      <w:r>
+        <w:t xml:space="preserve"> (</w:t>
+      </w:r>
+      <w:r>
+        <w:rPr>
+          <w:rFonts w:ascii="Consolas" w:cs="Consolas" w:eastAsia="Consolas" w:hAnsi="Consolas"/>
+          <w:sz w:val="19"/>
+          <w:szCs w:val="19"/>
+          <w:shd w:fill="F2F3F5" w:color="auto" w:val="clear"/>
+        </w:rPr>
+        <w:t xml:space="preserve">pre-receive hook declined</w:t>
+      </w:r>
+      <w:r>
+        <w:t xml:space="preserve">). Already   committed with the wrong identity? Re-stamp it:   </w:t>
+      </w:r>
+      <w:r>
+        <w:rPr>
+          <w:rFonts w:ascii="Consolas" w:cs="Consolas" w:eastAsia="Consolas" w:hAnsi="Consolas"/>
+          <w:sz w:val="19"/>
+          <w:szCs w:val="19"/>
+          <w:shd w:fill="F2F3F5" w:color="auto" w:val="clear"/>
+        </w:rPr>
+        <w:t xml:space="preserve">git commit --amend --reset-author --no-edit</w:t>
+      </w:r>
+      <w:r>
+        <w:t xml:space="preserve">.</w:t>
       </w:r>
     </w:p>
     <w:p>
@@ -9000,6 +9165,113 @@
                 <w:shd w:fill="F2F3F5" w:color="auto" w:val="clear"/>
               </w:rPr>
               <w:t xml:space="preserve">echo "U=[$U]"</w:t>
+            </w:r>
+          </w:p>
+        </w:tc>
+      </w:tr>
+      <w:tr>
+        <w:trPr>
+          <w:tblHeader w:val="false"/>
+        </w:trPr>
+        <w:tc>
+          <w:tcPr>
+            <w:tcW w:type="dxa" w:w="5040"/>
+            <w:tcMar>
+              <w:top w:type="dxa" w:w="40"/>
+              <w:left w:type="dxa" w:w="90"/>
+              <w:bottom w:type="dxa" w:w="40"/>
+              <w:right w:type="dxa" w:w="90"/>
+            </w:tcMar>
+          </w:tcPr>
+          <w:p>
+            <w:pPr>
+              <w:spacing w:after="0"/>
+            </w:pPr>
+            <w:r>
+              <w:rPr>
+                <w:b/>
+                <w:bCs/>
+              </w:rPr>
+              <w:t xml:space="preserve">Your</w:t>
+            </w:r>
+            <w:r>
+              <w:t xml:space="preserve"> push rejected </w:t>
+            </w:r>
+            <w:r>
+              <w:rPr>
+                <w:rFonts w:ascii="Consolas" w:cs="Consolas" w:eastAsia="Consolas" w:hAnsi="Consolas"/>
+                <w:sz w:val="19"/>
+                <w:szCs w:val="19"/>
+                <w:shd w:fill="F2F3F5" w:color="auto" w:val="clear"/>
+              </w:rPr>
+              <w:t xml:space="preserve">Your git author name is inconsistent with GitLab account name</w:t>
+            </w:r>
+            <w:r>
+              <w:t xml:space="preserve"> / </w:t>
+            </w:r>
+            <w:r>
+              <w:rPr>
+                <w:rFonts w:ascii="Consolas" w:cs="Consolas" w:eastAsia="Consolas" w:hAnsi="Consolas"/>
+                <w:sz w:val="19"/>
+                <w:szCs w:val="19"/>
+                <w:shd w:fill="F2F3F5" w:color="auto" w:val="clear"/>
+              </w:rPr>
+              <w:t xml:space="preserve">committer email … is not verified</w:t>
+            </w:r>
+          </w:p>
+        </w:tc>
+        <w:tc>
+          <w:tcPr>
+            <w:tcW w:type="dxa" w:w="5040"/>
+            <w:tcMar>
+              <w:top w:type="dxa" w:w="40"/>
+              <w:left w:type="dxa" w:w="90"/>
+              <w:bottom w:type="dxa" w:w="40"/>
+              <w:right w:type="dxa" w:w="90"/>
+            </w:tcMar>
+          </w:tcPr>
+          <w:p>
+            <w:pPr>
+              <w:spacing w:after="0"/>
+            </w:pPr>
+            <w:r>
+              <w:t xml:space="preserve">Your local git identity doesn't match your GitLab account. </w:t>
+            </w:r>
+            <w:r>
+              <w:rPr>
+                <w:rFonts w:ascii="Consolas" w:cs="Consolas" w:eastAsia="Consolas" w:hAnsi="Consolas"/>
+                <w:sz w:val="19"/>
+                <w:szCs w:val="19"/>
+                <w:shd w:fill="F2F3F5" w:color="auto" w:val="clear"/>
+              </w:rPr>
+              <w:t xml:space="preserve">git config user.name "&lt;GitLab full name or username&gt;"</w:t>
+            </w:r>
+            <w:r>
+              <w:t xml:space="preserve"> and </w:t>
+            </w:r>
+            <w:r>
+              <w:rPr>
+                <w:rFonts w:ascii="Consolas" w:cs="Consolas" w:eastAsia="Consolas" w:hAnsi="Consolas"/>
+                <w:sz w:val="19"/>
+                <w:szCs w:val="19"/>
+                <w:shd w:fill="F2F3F5" w:color="auto" w:val="clear"/>
+              </w:rPr>
+              <w:t xml:space="preserve">git config user.email "&lt;verified email&gt;"</w:t>
+            </w:r>
+            <w:r>
+              <w:t xml:space="preserve">, then </w:t>
+            </w:r>
+            <w:r>
+              <w:rPr>
+                <w:rFonts w:ascii="Consolas" w:cs="Consolas" w:eastAsia="Consolas" w:hAnsi="Consolas"/>
+                <w:sz w:val="19"/>
+                <w:szCs w:val="19"/>
+                <w:shd w:fill="F2F3F5" w:color="auto" w:val="clear"/>
+              </w:rPr>
+              <w:t xml:space="preserve">git commit --amend --reset-author --no-edit</w:t>
+            </w:r>
+            <w:r>
+              <w:t xml:space="preserve"> and push (Prerequisites)</w:t>
             </w:r>
           </w:p>
         </w:tc>

</xml_diff>

<commit_message>
fix(lab): ignoreDifferences on Deployment/spec/replicas (HPA vs Argo)
The api HPA (min 2) owns replicas while the overlay also sets it, so dev/prod
apps sat permanently OutOfSync and selfHeal fought the HPA. Add ignoreDifferences
on /spec/replicas to the dev appset + prod app; document it. Regenerate docx.

Co-Authored-By: Claude Opus 4.8 <noreply@anthropic.com>
</commit_message>
<xml_diff>
--- a/labs/three-tier/LAB-GUIDE.docx
+++ b/labs/three-tier/LAB-GUIDE.docx
@@ -9827,6 +9827,126 @@
                 <w:shd w:fill="F2F3F5" w:color="auto" w:val="clear"/>
               </w:rPr>
               <w:t xml:space="preserve">feature/$U</w:t>
+            </w:r>
+          </w:p>
+        </w:tc>
+      </w:tr>
+      <w:tr>
+        <w:trPr>
+          <w:tblHeader w:val="false"/>
+        </w:trPr>
+        <w:tc>
+          <w:tcPr>
+            <w:tcW w:type="dxa" w:w="5040"/>
+            <w:tcMar>
+              <w:top w:type="dxa" w:w="40"/>
+              <w:left w:type="dxa" w:w="90"/>
+              <w:bottom w:type="dxa" w:w="40"/>
+              <w:right w:type="dxa" w:w="90"/>
+            </w:tcMar>
+          </w:tcPr>
+          <w:p>
+            <w:pPr>
+              <w:spacing w:after="0"/>
+            </w:pPr>
+            <w:r>
+              <w:t xml:space="preserve">App stays </w:t>
+            </w:r>
+            <w:r>
+              <w:rPr>
+                <w:b/>
+                <w:bCs/>
+              </w:rPr>
+              <w:t xml:space="preserve">Healthy but OutOfSync</w:t>
+            </w:r>
+            <w:r>
+              <w:t xml:space="preserve"> (never settles)</w:t>
+            </w:r>
+          </w:p>
+        </w:tc>
+        <w:tc>
+          <w:tcPr>
+            <w:tcW w:type="dxa" w:w="5040"/>
+            <w:tcMar>
+              <w:top w:type="dxa" w:w="40"/>
+              <w:left w:type="dxa" w:w="90"/>
+              <w:bottom w:type="dxa" w:w="40"/>
+              <w:right w:type="dxa" w:w="90"/>
+            </w:tcMar>
+          </w:tcPr>
+          <w:p>
+            <w:pPr>
+              <w:spacing w:after="0"/>
+            </w:pPr>
+            <w:r>
+              <w:t xml:space="preserve">The api </w:t>
+            </w:r>
+            <w:r>
+              <w:rPr>
+                <w:b/>
+                <w:bCs/>
+              </w:rPr>
+              <w:t xml:space="preserve">HPA</w:t>
+            </w:r>
+            <w:r>
+              <w:t xml:space="preserve"> owns </w:t>
+            </w:r>
+            <w:r>
+              <w:rPr>
+                <w:rFonts w:ascii="Consolas" w:cs="Consolas" w:eastAsia="Consolas" w:hAnsi="Consolas"/>
+                <w:sz w:val="19"/>
+                <w:szCs w:val="19"/>
+                <w:shd w:fill="F2F3F5" w:color="auto" w:val="clear"/>
+              </w:rPr>
+              <w:t xml:space="preserve">spec/replicas</w:t>
+            </w:r>
+            <w:r>
+              <w:t xml:space="preserve"> while Git also sets it → perpetual diff. The Applications carry </w:t>
+            </w:r>
+            <w:r>
+              <w:rPr>
+                <w:rFonts w:ascii="Consolas" w:cs="Consolas" w:eastAsia="Consolas" w:hAnsi="Consolas"/>
+                <w:sz w:val="19"/>
+                <w:szCs w:val="19"/>
+                <w:shd w:fill="F2F3F5" w:color="auto" w:val="clear"/>
+              </w:rPr>
+              <w:t xml:space="preserve">ignoreDifferences</w:t>
+            </w:r>
+            <w:r>
+              <w:t xml:space="preserve"> on Deployment </w:t>
+            </w:r>
+            <w:r>
+              <w:rPr>
+                <w:rFonts w:ascii="Consolas" w:cs="Consolas" w:eastAsia="Consolas" w:hAnsi="Consolas"/>
+                <w:sz w:val="19"/>
+                <w:szCs w:val="19"/>
+                <w:shd w:fill="F2F3F5" w:color="auto" w:val="clear"/>
+              </w:rPr>
+              <w:t xml:space="preserve">/spec/replicas</w:t>
+            </w:r>
+            <w:r>
+              <w:t xml:space="preserve"> for this; if you see it, re-apply the updated </w:t>
+            </w:r>
+            <w:r>
+              <w:rPr>
+                <w:rFonts w:ascii="Consolas" w:cs="Consolas" w:eastAsia="Consolas" w:hAnsi="Consolas"/>
+                <w:sz w:val="19"/>
+                <w:szCs w:val="19"/>
+                <w:shd w:fill="F2F3F5" w:color="auto" w:val="clear"/>
+              </w:rPr>
+              <w:t xml:space="preserve">argocd/three-tier-dev-appset.yaml</w:t>
+            </w:r>
+            <w:r>
+              <w:t xml:space="preserve"> + </w:t>
+            </w:r>
+            <w:r>
+              <w:rPr>
+                <w:rFonts w:ascii="Consolas" w:cs="Consolas" w:eastAsia="Consolas" w:hAnsi="Consolas"/>
+                <w:sz w:val="19"/>
+                <w:szCs w:val="19"/>
+                <w:shd w:fill="F2F3F5" w:color="auto" w:val="clear"/>
+              </w:rPr>
+              <w:t xml:space="preserve">three-tier-prod.yaml</w:t>
             </w:r>
           </w:p>
         </w:tc>

</xml_diff>